<commit_message>
set week 4 files
</commit_message>
<xml_diff>
--- a/week4/stage01/Stage_1_Lab_Student_Handout.docx
+++ b/week4/stage01/Stage_1_Lab_Student_Handout.docx
@@ -1,6 +1,6 @@
 
 <file path=word/document.xml><?xml version="1.0" encoding="utf-8"?>
-<w:document xmlns:wpc="http://schemas.microsoft.com/office/word/2010/wordprocessingCanvas" xmlns:cx="http://schemas.microsoft.com/office/drawing/2014/chartex" xmlns:cx1="http://schemas.microsoft.com/office/drawing/2015/9/8/chartex" xmlns:cx2="http://schemas.microsoft.com/office/drawing/2015/10/21/chartex" xmlns:cx3="http://schemas.microsoft.com/office/drawing/2016/5/9/chartex" xmlns:cx4="http://schemas.microsoft.com/office/drawing/2016/5/10/chartex" xmlns:cx5="http://schemas.microsoft.com/office/drawing/2016/5/11/chartex" xmlns:cx6="http://schemas.microsoft.com/office/drawing/2016/5/12/chartex" xmlns:cx7="http://schemas.microsoft.com/office/drawing/2016/5/13/chartex" xmlns:cx8="http://schemas.microsoft.com/office/drawing/2016/5/14/chartex" xmlns:mc="http://schemas.openxmlformats.org/markup-compatibility/2006" xmlns:aink="http://schemas.microsoft.com/office/drawing/2016/ink" xmlns:am3d="http://schemas.microsoft.com/office/drawing/2017/model3d" xmlns:o="urn:schemas-microsoft-com:office:office" xmlns:oel="http://schemas.microsoft.com/office/2019/extlst" xmlns:r="http://schemas.openxmlformats.org/officeDocument/2006/relationships" xmlns:m="http://schemas.openxmlformats.org/officeDocument/2006/math" xmlns:v="urn:schemas-microsoft-com:vml" xmlns:wp14="http://schemas.microsoft.com/office/word/2010/wordprocessingDrawing" xmlns:wp="http://schemas.openxmlformats.org/drawingml/2006/wordprocessingDrawing" xmlns:w10="urn:schemas-microsoft-com:office:word" xmlns:w="http://schemas.openxmlformats.org/wordprocessingml/2006/main" xmlns:w14="http://schemas.microsoft.com/office/word/2010/wordml" xmlns:w15="http://schemas.microsoft.com/office/word/2012/wordml" xmlns:w16cei="http://schemas.microsoft.com/office/word/2026/wordml/cei" xmlns:w16cex="http://schemas.microsoft.com/office/word/2018/wordml/cex" xmlns:w16cid="http://schemas.microsoft.com/office/word/2016/wordml/cid" xmlns:w16="http://schemas.microsoft.com/office/word/2018/wordml" xmlns:w16du="http://schemas.microsoft.com/office/word/2023/wordml/word16du" xmlns:w16sdtdh="http://schemas.microsoft.com/office/word/2020/wordml/sdtdatahash" xmlns:w16sdtfl="http://schemas.microsoft.com/office/word/2024/wordml/sdtformatlock" xmlns:w16se="http://schemas.microsoft.com/office/word/2015/wordml/symex" xmlns:wpg="http://schemas.microsoft.com/office/word/2010/wordprocessingGroup" xmlns:wpi="http://schemas.microsoft.com/office/word/2010/wordprocessingInk" xmlns:wne="http://schemas.microsoft.com/office/word/2006/wordml" xmlns:wps="http://schemas.microsoft.com/office/word/2010/wordprocessingShape" mc:Ignorable="w14 w15 w16se w16cid w16 w16cex w16sdtdh w16sdtfl w16du wp14">
+<w:document xmlns:wpc="http://schemas.microsoft.com/office/word/2010/wordprocessingCanvas" xmlns:cx="http://schemas.microsoft.com/office/drawing/2014/chartex" xmlns:cx1="http://schemas.microsoft.com/office/drawing/2015/9/8/chartex" xmlns:cx2="http://schemas.microsoft.com/office/drawing/2015/10/21/chartex" xmlns:cx3="http://schemas.microsoft.com/office/drawing/2016/5/9/chartex" xmlns:cx4="http://schemas.microsoft.com/office/drawing/2016/5/10/chartex" xmlns:cx5="http://schemas.microsoft.com/office/drawing/2016/5/11/chartex" xmlns:cx6="http://schemas.microsoft.com/office/drawing/2016/5/12/chartex" xmlns:cx7="http://schemas.microsoft.com/office/drawing/2016/5/13/chartex" xmlns:cx8="http://schemas.microsoft.com/office/drawing/2016/5/14/chartex" xmlns:mc="http://schemas.openxmlformats.org/markup-compatibility/2006" xmlns:aink="http://schemas.microsoft.com/office/drawing/2016/ink" xmlns:am3d="http://schemas.microsoft.com/office/drawing/2017/model3d" xmlns:o="urn:schemas-microsoft-com:office:office" xmlns:oel="http://schemas.microsoft.com/office/2019/extlst" xmlns:r="http://schemas.openxmlformats.org/officeDocument/2006/relationships" xmlns:m="http://schemas.openxmlformats.org/officeDocument/2006/math" xmlns:v="urn:schemas-microsoft-com:vml" xmlns:wp14="http://schemas.microsoft.com/office/word/2010/wordprocessingDrawing" xmlns:wp="http://schemas.openxmlformats.org/drawingml/2006/wordprocessingDrawing" xmlns:w10="urn:schemas-microsoft-com:office:word" xmlns:w="http://schemas.openxmlformats.org/wordprocessingml/2006/main" xmlns:w14="http://schemas.microsoft.com/office/word/2010/wordml" xmlns:w15="http://schemas.microsoft.com/office/word/2012/wordml" xmlns:w16cex="http://schemas.microsoft.com/office/word/2018/wordml/cex" xmlns:w16cid="http://schemas.microsoft.com/office/word/2016/wordml/cid" xmlns:w16="http://schemas.microsoft.com/office/word/2018/wordml" xmlns:w16du="http://schemas.microsoft.com/office/word/2023/wordml/word16du" xmlns:w16sdtdh="http://schemas.microsoft.com/office/word/2020/wordml/sdtdatahash" xmlns:w16sdtfl="http://schemas.microsoft.com/office/word/2024/wordml/sdtformatlock" xmlns:w16se="http://schemas.microsoft.com/office/word/2015/wordml/symex" xmlns:wpg="http://schemas.microsoft.com/office/word/2010/wordprocessingGroup" xmlns:wpi="http://schemas.microsoft.com/office/word/2010/wordprocessingInk" xmlns:wne="http://schemas.microsoft.com/office/word/2006/wordml" xmlns:wps="http://schemas.microsoft.com/office/word/2010/wordprocessingShape" mc:Ignorable="w14 w15 w16se w16cid w16 w16cex w16sdtdh w16sdtfl w16du wp14">
   <w:body>
     <w:p>
       <w:pPr>
@@ -8,16 +8,7 @@
         <w:jc w:val="center"/>
       </w:pPr>
       <w:r>
-        <w:t xml:space="preserve">Stage </w:t>
-      </w:r>
-      <w:r>
-        <w:t>1</w:t>
-      </w:r>
-      <w:r>
-        <w:t xml:space="preserve"> Lab</w:t>
-      </w:r>
-      <w:r>
-        <w:t xml:space="preserve"> - Human vs AI: Building Your First SmartCare Prototype</w:t>
+        <w:t>Stage 1 Lab - Human vs AI: Building Your First SmartCare Prototype</w:t>
       </w:r>
     </w:p>
     <w:p>
@@ -36,7 +27,17 @@
         <w:t>Create and run a simple Python file</w:t>
       </w:r>
       <w:r>
-        <w:t xml:space="preserve"> with basic input,output and processing statements</w:t>
+        <w:t xml:space="preserve"> with basic </w:t>
+      </w:r>
+      <w:proofErr w:type="spellStart"/>
+      <w:proofErr w:type="gramStart"/>
+      <w:r>
+        <w:t>input,output</w:t>
+      </w:r>
+      <w:proofErr w:type="spellEnd"/>
+      <w:proofErr w:type="gramEnd"/>
+      <w:r>
+        <w:t xml:space="preserve"> and processing statements</w:t>
       </w:r>
     </w:p>
     <w:p>
@@ -103,10 +104,7 @@
     </w:p>
     <w:p>
       <w:r>
-        <w:t>stage</w:t>
-      </w:r>
-      <w:r>
-        <w:t>01/</w:t>
+        <w:t>stage01/</w:t>
       </w:r>
       <w:r>
         <w:br/>
@@ -196,79 +194,81 @@
           <w:b/>
           <w:bCs/>
         </w:rPr>
-        <w:t># Create and run a simple Python file with basic input,output statements</w:t>
-      </w:r>
-    </w:p>
-    <w:p>
-      <w:pPr>
-        <w:spacing w:after="0"/>
+        <w:t xml:space="preserve"># Create and run a simple Python file with basic </w:t>
+      </w:r>
+      <w:proofErr w:type="spellStart"/>
+      <w:proofErr w:type="gramStart"/>
+      <w:r>
         <w:rPr>
           <w:rFonts w:ascii="Courier New" w:hAnsi="Courier New" w:cs="Courier New"/>
           <w:b/>
           <w:bCs/>
         </w:rPr>
-      </w:pPr>
-    </w:p>
-    <w:p>
-      <w:pPr>
-        <w:spacing w:after="0"/>
+        <w:t>input,output</w:t>
+      </w:r>
+      <w:proofErr w:type="spellEnd"/>
+      <w:proofErr w:type="gramEnd"/>
+      <w:r>
         <w:rPr>
           <w:rFonts w:ascii="Courier New" w:hAnsi="Courier New" w:cs="Courier New"/>
           <w:b/>
           <w:bCs/>
         </w:rPr>
-      </w:pPr>
-      <w:r>
+        <w:t xml:space="preserve"> statements</w:t>
+      </w:r>
+    </w:p>
+    <w:p>
+      <w:pPr>
+        <w:spacing w:after="0"/>
         <w:rPr>
           <w:rFonts w:ascii="Courier New" w:hAnsi="Courier New" w:cs="Courier New"/>
           <w:b/>
           <w:bCs/>
         </w:rPr>
-        <w:t xml:space="preserve">print("Welcome to SmartCare: Community Clinic </w:t>
-      </w:r>
-      <w:r>
+      </w:pPr>
+    </w:p>
+    <w:p>
+      <w:pPr>
+        <w:spacing w:after="0"/>
         <w:rPr>
           <w:rFonts w:ascii="Courier New" w:hAnsi="Courier New" w:cs="Courier New"/>
           <w:b/>
           <w:bCs/>
         </w:rPr>
-        <w:t>Appointment Booking</w:t>
-      </w:r>
+      </w:pPr>
+      <w:proofErr w:type="gramStart"/>
       <w:r>
         <w:rPr>
           <w:rFonts w:ascii="Courier New" w:hAnsi="Courier New" w:cs="Courier New"/>
           <w:b/>
           <w:bCs/>
         </w:rPr>
-        <w:t xml:space="preserve"> System!")</w:t>
-      </w:r>
-    </w:p>
-    <w:p>
-      <w:pPr>
-        <w:spacing w:after="0"/>
+        <w:t>print(</w:t>
+      </w:r>
+      <w:proofErr w:type="gramEnd"/>
+      <w:r>
         <w:rPr>
           <w:rFonts w:ascii="Courier New" w:hAnsi="Courier New" w:cs="Courier New"/>
           <w:b/>
           <w:bCs/>
         </w:rPr>
-      </w:pPr>
-    </w:p>
-    <w:p>
-      <w:pPr>
-        <w:spacing w:after="0"/>
+        <w:t xml:space="preserve">"Welcome to SmartCare: Community Clinic </w:t>
+      </w:r>
+      <w:r>
         <w:rPr>
           <w:rFonts w:ascii="Courier New" w:hAnsi="Courier New" w:cs="Courier New"/>
           <w:b/>
           <w:bCs/>
         </w:rPr>
-      </w:pPr>
+        <w:t>Appointment Booking</w:t>
+      </w:r>
       <w:r>
         <w:rPr>
           <w:rFonts w:ascii="Courier New" w:hAnsi="Courier New" w:cs="Courier New"/>
           <w:b/>
           <w:bCs/>
         </w:rPr>
-        <w:t># First Appointment</w:t>
+        <w:t xml:space="preserve"> System!")</w:t>
       </w:r>
     </w:p>
     <w:p>
@@ -280,79 +280,78 @@
           <w:bCs/>
         </w:rPr>
       </w:pPr>
-      <w:r>
+    </w:p>
+    <w:p>
+      <w:pPr>
+        <w:spacing w:after="0"/>
         <w:rPr>
           <w:rFonts w:ascii="Courier New" w:hAnsi="Courier New" w:cs="Courier New"/>
           <w:b/>
           <w:bCs/>
         </w:rPr>
-        <w:t>patient1_name = 'Alice Smith'</w:t>
-      </w:r>
-    </w:p>
-    <w:p>
-      <w:pPr>
-        <w:spacing w:after="0"/>
+      </w:pPr>
+      <w:r>
         <w:rPr>
           <w:rFonts w:ascii="Courier New" w:hAnsi="Courier New" w:cs="Courier New"/>
           <w:b/>
           <w:bCs/>
         </w:rPr>
-      </w:pPr>
-      <w:r>
+        <w:t># First Appointment</w:t>
+      </w:r>
+    </w:p>
+    <w:p>
+      <w:pPr>
+        <w:spacing w:after="0"/>
         <w:rPr>
           <w:rFonts w:ascii="Courier New" w:hAnsi="Courier New" w:cs="Courier New"/>
           <w:b/>
           <w:bCs/>
         </w:rPr>
-        <w:t>practitioner1_name = 'Dr. John Doe'</w:t>
-      </w:r>
-    </w:p>
-    <w:p>
-      <w:pPr>
-        <w:spacing w:after="0"/>
+      </w:pPr>
+      <w:r>
         <w:rPr>
           <w:rFonts w:ascii="Courier New" w:hAnsi="Courier New" w:cs="Courier New"/>
           <w:b/>
           <w:bCs/>
         </w:rPr>
-      </w:pPr>
-      <w:r>
+        <w:t>patient1_name = 'Alice Smith'</w:t>
+      </w:r>
+    </w:p>
+    <w:p>
+      <w:pPr>
+        <w:spacing w:after="0"/>
         <w:rPr>
           <w:rFonts w:ascii="Courier New" w:hAnsi="Courier New" w:cs="Courier New"/>
           <w:b/>
           <w:bCs/>
         </w:rPr>
-        <w:t>appointment1_time = '2024-07-20 10:00 AM'</w:t>
-      </w:r>
-    </w:p>
-    <w:p>
-      <w:pPr>
-        <w:spacing w:after="0"/>
+      </w:pPr>
+      <w:r>
         <w:rPr>
           <w:rFonts w:ascii="Courier New" w:hAnsi="Courier New" w:cs="Courier New"/>
           <w:b/>
           <w:bCs/>
         </w:rPr>
-      </w:pPr>
-      <w:r>
+        <w:t>practitioner1_name = 'Dr. John Doe'</w:t>
+      </w:r>
+    </w:p>
+    <w:p>
+      <w:pPr>
+        <w:spacing w:after="0"/>
         <w:rPr>
           <w:rFonts w:ascii="Courier New" w:hAnsi="Courier New" w:cs="Courier New"/>
           <w:b/>
           <w:bCs/>
         </w:rPr>
-        <w:lastRenderedPageBreak/>
-        <w:t>print(f"Patient: {patient1_name} | Practitioner: {practitioner1_name} | Time: {appointment1_time}")</w:t>
-      </w:r>
-    </w:p>
-    <w:p>
-      <w:pPr>
-        <w:spacing w:after="0"/>
+      </w:pPr>
+      <w:r>
         <w:rPr>
           <w:rFonts w:ascii="Courier New" w:hAnsi="Courier New" w:cs="Courier New"/>
           <w:b/>
           <w:bCs/>
         </w:rPr>
-      </w:pPr>
+        <w:t>appointment1_time = '2024-07-20 10:00 AM'</w:t>
+      </w:r>
     </w:p>
     <w:p>
       <w:pPr>
@@ -363,67 +362,70 @@
           <w:bCs/>
         </w:rPr>
       </w:pPr>
+      <w:proofErr w:type="gramStart"/>
       <w:r>
         <w:rPr>
           <w:rFonts w:ascii="Courier New" w:hAnsi="Courier New" w:cs="Courier New"/>
           <w:b/>
           <w:bCs/>
         </w:rPr>
-        <w:t># Second Appointment</w:t>
-      </w:r>
-    </w:p>
-    <w:p>
-      <w:pPr>
-        <w:spacing w:after="0"/>
+        <w:lastRenderedPageBreak/>
+        <w:t>print(</w:t>
+      </w:r>
+      <w:proofErr w:type="spellStart"/>
+      <w:proofErr w:type="gramEnd"/>
+      <w:r>
         <w:rPr>
           <w:rFonts w:ascii="Courier New" w:hAnsi="Courier New" w:cs="Courier New"/>
           <w:b/>
           <w:bCs/>
         </w:rPr>
-      </w:pPr>
+        <w:t>f"</w:t>
+      </w:r>
+      <w:proofErr w:type="gramStart"/>
       <w:r>
         <w:rPr>
           <w:rFonts w:ascii="Courier New" w:hAnsi="Courier New" w:cs="Courier New"/>
           <w:b/>
           <w:bCs/>
         </w:rPr>
-        <w:t>patient2_name = 'Bob Johnson'</w:t>
-      </w:r>
-    </w:p>
-    <w:p>
-      <w:pPr>
-        <w:spacing w:after="0"/>
+        <w:t>Patient</w:t>
+      </w:r>
+      <w:proofErr w:type="spellEnd"/>
+      <w:r>
         <w:rPr>
           <w:rFonts w:ascii="Courier New" w:hAnsi="Courier New" w:cs="Courier New"/>
           <w:b/>
           <w:bCs/>
         </w:rPr>
-      </w:pPr>
+        <w:t>: {</w:t>
+      </w:r>
+      <w:proofErr w:type="gramEnd"/>
       <w:r>
         <w:rPr>
           <w:rFonts w:ascii="Courier New" w:hAnsi="Courier New" w:cs="Courier New"/>
           <w:b/>
           <w:bCs/>
         </w:rPr>
-        <w:t>practitioner2_name = 'Dr. Jane Roe'</w:t>
-      </w:r>
-    </w:p>
-    <w:p>
-      <w:pPr>
-        <w:spacing w:after="0"/>
+        <w:t>patient1_name} | Practitioner: {practitioner1_name} | Time: {appointment1_</w:t>
+      </w:r>
+      <w:proofErr w:type="gramStart"/>
+      <w:r>
         <w:rPr>
           <w:rFonts w:ascii="Courier New" w:hAnsi="Courier New" w:cs="Courier New"/>
           <w:b/>
           <w:bCs/>
         </w:rPr>
-      </w:pPr>
+        <w:t>time}"</w:t>
+      </w:r>
+      <w:proofErr w:type="gramEnd"/>
       <w:r>
         <w:rPr>
           <w:rFonts w:ascii="Courier New" w:hAnsi="Courier New" w:cs="Courier New"/>
           <w:b/>
           <w:bCs/>
         </w:rPr>
-        <w:t>appointment2_time = '2024-07-20 11:30 AM'</w:t>
+        <w:t>)</w:t>
       </w:r>
     </w:p>
     <w:p>
@@ -435,13 +437,151 @@
           <w:bCs/>
         </w:rPr>
       </w:pPr>
-      <w:r>
+    </w:p>
+    <w:p>
+      <w:pPr>
+        <w:spacing w:after="0"/>
         <w:rPr>
           <w:rFonts w:ascii="Courier New" w:hAnsi="Courier New" w:cs="Courier New"/>
           <w:b/>
           <w:bCs/>
         </w:rPr>
-        <w:t>print(f"Patient: {patient2_name} | Practitioner: {practitioner2_name} | Time: {appointment2_time}")</w:t>
+      </w:pPr>
+      <w:r>
+        <w:rPr>
+          <w:rFonts w:ascii="Courier New" w:hAnsi="Courier New" w:cs="Courier New"/>
+          <w:b/>
+          <w:bCs/>
+        </w:rPr>
+        <w:t># Second Appointment</w:t>
+      </w:r>
+    </w:p>
+    <w:p>
+      <w:pPr>
+        <w:spacing w:after="0"/>
+        <w:rPr>
+          <w:rFonts w:ascii="Courier New" w:hAnsi="Courier New" w:cs="Courier New"/>
+          <w:b/>
+          <w:bCs/>
+        </w:rPr>
+      </w:pPr>
+      <w:r>
+        <w:rPr>
+          <w:rFonts w:ascii="Courier New" w:hAnsi="Courier New" w:cs="Courier New"/>
+          <w:b/>
+          <w:bCs/>
+        </w:rPr>
+        <w:t>patient2_name = 'Bob Johnson'</w:t>
+      </w:r>
+    </w:p>
+    <w:p>
+      <w:pPr>
+        <w:spacing w:after="0"/>
+        <w:rPr>
+          <w:rFonts w:ascii="Courier New" w:hAnsi="Courier New" w:cs="Courier New"/>
+          <w:b/>
+          <w:bCs/>
+        </w:rPr>
+      </w:pPr>
+      <w:r>
+        <w:rPr>
+          <w:rFonts w:ascii="Courier New" w:hAnsi="Courier New" w:cs="Courier New"/>
+          <w:b/>
+          <w:bCs/>
+        </w:rPr>
+        <w:t>practitioner2_name = 'Dr. Jane Roe'</w:t>
+      </w:r>
+    </w:p>
+    <w:p>
+      <w:pPr>
+        <w:spacing w:after="0"/>
+        <w:rPr>
+          <w:rFonts w:ascii="Courier New" w:hAnsi="Courier New" w:cs="Courier New"/>
+          <w:b/>
+          <w:bCs/>
+        </w:rPr>
+      </w:pPr>
+      <w:r>
+        <w:rPr>
+          <w:rFonts w:ascii="Courier New" w:hAnsi="Courier New" w:cs="Courier New"/>
+          <w:b/>
+          <w:bCs/>
+        </w:rPr>
+        <w:t>appointment2_time = '2024-07-20 11:30 AM'</w:t>
+      </w:r>
+    </w:p>
+    <w:p>
+      <w:pPr>
+        <w:spacing w:after="0"/>
+        <w:rPr>
+          <w:rFonts w:ascii="Courier New" w:hAnsi="Courier New" w:cs="Courier New"/>
+          <w:b/>
+          <w:bCs/>
+        </w:rPr>
+      </w:pPr>
+      <w:proofErr w:type="gramStart"/>
+      <w:r>
+        <w:rPr>
+          <w:rFonts w:ascii="Courier New" w:hAnsi="Courier New" w:cs="Courier New"/>
+          <w:b/>
+          <w:bCs/>
+        </w:rPr>
+        <w:t>print(</w:t>
+      </w:r>
+      <w:proofErr w:type="spellStart"/>
+      <w:proofErr w:type="gramEnd"/>
+      <w:r>
+        <w:rPr>
+          <w:rFonts w:ascii="Courier New" w:hAnsi="Courier New" w:cs="Courier New"/>
+          <w:b/>
+          <w:bCs/>
+        </w:rPr>
+        <w:t>f"</w:t>
+      </w:r>
+      <w:proofErr w:type="gramStart"/>
+      <w:r>
+        <w:rPr>
+          <w:rFonts w:ascii="Courier New" w:hAnsi="Courier New" w:cs="Courier New"/>
+          <w:b/>
+          <w:bCs/>
+        </w:rPr>
+        <w:t>Patient</w:t>
+      </w:r>
+      <w:proofErr w:type="spellEnd"/>
+      <w:r>
+        <w:rPr>
+          <w:rFonts w:ascii="Courier New" w:hAnsi="Courier New" w:cs="Courier New"/>
+          <w:b/>
+          <w:bCs/>
+        </w:rPr>
+        <w:t>: {</w:t>
+      </w:r>
+      <w:proofErr w:type="gramEnd"/>
+      <w:r>
+        <w:rPr>
+          <w:rFonts w:ascii="Courier New" w:hAnsi="Courier New" w:cs="Courier New"/>
+          <w:b/>
+          <w:bCs/>
+        </w:rPr>
+        <w:t>patient2_name} | Practitioner: {practitioner2_name} | Time: {appointment2_</w:t>
+      </w:r>
+      <w:proofErr w:type="gramStart"/>
+      <w:r>
+        <w:rPr>
+          <w:rFonts w:ascii="Courier New" w:hAnsi="Courier New" w:cs="Courier New"/>
+          <w:b/>
+          <w:bCs/>
+        </w:rPr>
+        <w:t>time}"</w:t>
+      </w:r>
+      <w:proofErr w:type="gramEnd"/>
+      <w:r>
+        <w:rPr>
+          <w:rFonts w:ascii="Courier New" w:hAnsi="Courier New" w:cs="Courier New"/>
+          <w:b/>
+          <w:bCs/>
+        </w:rPr>
+        <w:t>)</w:t>
       </w:r>
     </w:p>
     <w:p>
@@ -551,19 +691,19 @@
           <w:bCs/>
           <w:lang w:val="en-AU"/>
         </w:rPr>
-        <w:t>def book_appointment(patient_name, practitioner_name, appointment_time):</w:t>
-      </w:r>
-    </w:p>
-    <w:p>
-      <w:pPr>
-        <w:spacing w:after="0"/>
+        <w:t xml:space="preserve">def </w:t>
+      </w:r>
+      <w:proofErr w:type="spellStart"/>
+      <w:r>
         <w:rPr>
           <w:rFonts w:ascii="Courier New" w:hAnsi="Courier New" w:cs="Courier New"/>
           <w:b/>
           <w:bCs/>
           <w:lang w:val="en-AU"/>
         </w:rPr>
-      </w:pPr>
+        <w:t>book_</w:t>
+      </w:r>
+      <w:proofErr w:type="gramStart"/>
       <w:r>
         <w:rPr>
           <w:rFonts w:ascii="Courier New" w:hAnsi="Courier New" w:cs="Courier New"/>
@@ -571,19 +711,20 @@
           <w:bCs/>
           <w:lang w:val="en-AU"/>
         </w:rPr>
-        <w:t>    if not patient_name:</w:t>
-      </w:r>
-    </w:p>
-    <w:p>
-      <w:pPr>
-        <w:spacing w:after="0"/>
+        <w:t>appointment</w:t>
+      </w:r>
+      <w:proofErr w:type="spellEnd"/>
+      <w:r>
         <w:rPr>
           <w:rFonts w:ascii="Courier New" w:hAnsi="Courier New" w:cs="Courier New"/>
           <w:b/>
           <w:bCs/>
           <w:lang w:val="en-AU"/>
         </w:rPr>
-      </w:pPr>
+        <w:t>(</w:t>
+      </w:r>
+      <w:proofErr w:type="spellStart"/>
+      <w:proofErr w:type="gramEnd"/>
       <w:r>
         <w:rPr>
           <w:rFonts w:ascii="Courier New" w:hAnsi="Courier New" w:cs="Courier New"/>
@@ -591,19 +732,19 @@
           <w:bCs/>
           <w:lang w:val="en-AU"/>
         </w:rPr>
-        <w:t>        raise ValueError("Patient name cannot be empty")</w:t>
-      </w:r>
-    </w:p>
-    <w:p>
-      <w:pPr>
-        <w:spacing w:after="0"/>
+        <w:t>patient_name</w:t>
+      </w:r>
+      <w:proofErr w:type="spellEnd"/>
+      <w:r>
         <w:rPr>
           <w:rFonts w:ascii="Courier New" w:hAnsi="Courier New" w:cs="Courier New"/>
           <w:b/>
           <w:bCs/>
           <w:lang w:val="en-AU"/>
         </w:rPr>
-      </w:pPr>
+        <w:t xml:space="preserve">, </w:t>
+      </w:r>
+      <w:proofErr w:type="spellStart"/>
       <w:r>
         <w:rPr>
           <w:rFonts w:ascii="Courier New" w:hAnsi="Courier New" w:cs="Courier New"/>
@@ -611,19 +752,19 @@
           <w:bCs/>
           <w:lang w:val="en-AU"/>
         </w:rPr>
-        <w:t>    appointment = {</w:t>
-      </w:r>
-    </w:p>
-    <w:p>
-      <w:pPr>
-        <w:spacing w:after="0"/>
+        <w:t>practitioner_name</w:t>
+      </w:r>
+      <w:proofErr w:type="spellEnd"/>
+      <w:r>
         <w:rPr>
           <w:rFonts w:ascii="Courier New" w:hAnsi="Courier New" w:cs="Courier New"/>
           <w:b/>
           <w:bCs/>
           <w:lang w:val="en-AU"/>
         </w:rPr>
-      </w:pPr>
+        <w:t xml:space="preserve">, </w:t>
+      </w:r>
+      <w:proofErr w:type="spellStart"/>
       <w:r>
         <w:rPr>
           <w:rFonts w:ascii="Courier New" w:hAnsi="Courier New" w:cs="Courier New"/>
@@ -631,39 +772,39 @@
           <w:bCs/>
           <w:lang w:val="en-AU"/>
         </w:rPr>
-        <w:t>        "patient": patient_name,</w:t>
-      </w:r>
-    </w:p>
-    <w:p>
-      <w:pPr>
-        <w:spacing w:after="0"/>
+        <w:t>appointment_time</w:t>
+      </w:r>
+      <w:proofErr w:type="spellEnd"/>
+      <w:r>
         <w:rPr>
           <w:rFonts w:ascii="Courier New" w:hAnsi="Courier New" w:cs="Courier New"/>
           <w:b/>
           <w:bCs/>
           <w:lang w:val="en-AU"/>
         </w:rPr>
-      </w:pPr>
-      <w:r>
+        <w:t>):</w:t>
+      </w:r>
+    </w:p>
+    <w:p>
+      <w:pPr>
+        <w:spacing w:after="0"/>
         <w:rPr>
           <w:rFonts w:ascii="Courier New" w:hAnsi="Courier New" w:cs="Courier New"/>
           <w:b/>
           <w:bCs/>
           <w:lang w:val="en-AU"/>
         </w:rPr>
-        <w:t>        "practitioner": practitioner_name,</w:t>
-      </w:r>
-    </w:p>
-    <w:p>
-      <w:pPr>
-        <w:spacing w:after="0"/>
+      </w:pPr>
+      <w:r>
         <w:rPr>
           <w:rFonts w:ascii="Courier New" w:hAnsi="Courier New" w:cs="Courier New"/>
           <w:b/>
           <w:bCs/>
           <w:lang w:val="en-AU"/>
         </w:rPr>
-      </w:pPr>
+        <w:t xml:space="preserve">    if not </w:t>
+      </w:r>
+      <w:proofErr w:type="spellStart"/>
       <w:r>
         <w:rPr>
           <w:rFonts w:ascii="Courier New" w:hAnsi="Courier New" w:cs="Courier New"/>
@@ -671,39 +812,40 @@
           <w:bCs/>
           <w:lang w:val="en-AU"/>
         </w:rPr>
-        <w:t>        "time": appointment_time</w:t>
-      </w:r>
-    </w:p>
-    <w:p>
-      <w:pPr>
-        <w:spacing w:after="0"/>
+        <w:t>patient_name</w:t>
+      </w:r>
+      <w:proofErr w:type="spellEnd"/>
+      <w:r>
         <w:rPr>
           <w:rFonts w:ascii="Courier New" w:hAnsi="Courier New" w:cs="Courier New"/>
           <w:b/>
           <w:bCs/>
           <w:lang w:val="en-AU"/>
         </w:rPr>
-      </w:pPr>
-      <w:r>
+        <w:t>:</w:t>
+      </w:r>
+    </w:p>
+    <w:p>
+      <w:pPr>
+        <w:spacing w:after="0"/>
         <w:rPr>
           <w:rFonts w:ascii="Courier New" w:hAnsi="Courier New" w:cs="Courier New"/>
           <w:b/>
           <w:bCs/>
           <w:lang w:val="en-AU"/>
         </w:rPr>
-        <w:t>    }</w:t>
-      </w:r>
-    </w:p>
-    <w:p>
-      <w:pPr>
-        <w:spacing w:after="0"/>
+      </w:pPr>
+      <w:r>
         <w:rPr>
           <w:rFonts w:ascii="Courier New" w:hAnsi="Courier New" w:cs="Courier New"/>
           <w:b/>
           <w:bCs/>
           <w:lang w:val="en-AU"/>
         </w:rPr>
-      </w:pPr>
+        <w:t xml:space="preserve">        raise </w:t>
+      </w:r>
+      <w:proofErr w:type="spellStart"/>
+      <w:proofErr w:type="gramStart"/>
       <w:r>
         <w:rPr>
           <w:rFonts w:ascii="Courier New" w:hAnsi="Courier New" w:cs="Courier New"/>
@@ -711,70 +853,69 @@
           <w:bCs/>
           <w:lang w:val="en-AU"/>
         </w:rPr>
-        <w:t>    appointments.append(appointment)</w:t>
-      </w:r>
-    </w:p>
-    <w:p>
-      <w:pPr>
-        <w:spacing w:after="0"/>
+        <w:t>ValueError</w:t>
+      </w:r>
+      <w:proofErr w:type="spellEnd"/>
+      <w:r>
         <w:rPr>
           <w:rFonts w:ascii="Courier New" w:hAnsi="Courier New" w:cs="Courier New"/>
           <w:b/>
           <w:bCs/>
           <w:lang w:val="en-AU"/>
         </w:rPr>
-      </w:pPr>
-    </w:p>
-    <w:p>
-      <w:pPr>
-        <w:spacing w:after="0"/>
+        <w:t>(</w:t>
+      </w:r>
+      <w:proofErr w:type="gramEnd"/>
+      <w:r>
         <w:rPr>
           <w:rFonts w:ascii="Courier New" w:hAnsi="Courier New" w:cs="Courier New"/>
           <w:b/>
           <w:bCs/>
           <w:lang w:val="en-AU"/>
         </w:rPr>
-      </w:pPr>
-      <w:r>
+        <w:t>"Patient name cannot be empty")</w:t>
+      </w:r>
+    </w:p>
+    <w:p>
+      <w:pPr>
+        <w:spacing w:after="0"/>
         <w:rPr>
           <w:rFonts w:ascii="Courier New" w:hAnsi="Courier New" w:cs="Courier New"/>
           <w:b/>
           <w:bCs/>
           <w:lang w:val="en-AU"/>
         </w:rPr>
-        <w:t>def display_appointments():</w:t>
-      </w:r>
-    </w:p>
-    <w:p>
-      <w:pPr>
-        <w:spacing w:after="0"/>
+      </w:pPr>
+      <w:r>
         <w:rPr>
           <w:rFonts w:ascii="Courier New" w:hAnsi="Courier New" w:cs="Courier New"/>
           <w:b/>
           <w:bCs/>
           <w:lang w:val="en-AU"/>
         </w:rPr>
-      </w:pPr>
-      <w:r>
+        <w:t>    appointment = {</w:t>
+      </w:r>
+    </w:p>
+    <w:p>
+      <w:pPr>
+        <w:spacing w:after="0"/>
         <w:rPr>
           <w:rFonts w:ascii="Courier New" w:hAnsi="Courier New" w:cs="Courier New"/>
           <w:b/>
           <w:bCs/>
           <w:lang w:val="en-AU"/>
         </w:rPr>
-        <w:t>    if not appointments:</w:t>
-      </w:r>
-    </w:p>
-    <w:p>
-      <w:pPr>
-        <w:spacing w:after="0"/>
+      </w:pPr>
+      <w:r>
         <w:rPr>
           <w:rFonts w:ascii="Courier New" w:hAnsi="Courier New" w:cs="Courier New"/>
           <w:b/>
           <w:bCs/>
           <w:lang w:val="en-AU"/>
         </w:rPr>
-      </w:pPr>
+        <w:t xml:space="preserve">        "patient": </w:t>
+      </w:r>
+      <w:proofErr w:type="spellStart"/>
       <w:r>
         <w:rPr>
           <w:rFonts w:ascii="Courier New" w:hAnsi="Courier New" w:cs="Courier New"/>
@@ -782,39 +923,39 @@
           <w:bCs/>
           <w:lang w:val="en-AU"/>
         </w:rPr>
-        <w:t>        print("No appointments recorded.")</w:t>
-      </w:r>
-    </w:p>
-    <w:p>
-      <w:pPr>
-        <w:spacing w:after="0"/>
+        <w:t>patient_name</w:t>
+      </w:r>
+      <w:proofErr w:type="spellEnd"/>
+      <w:r>
         <w:rPr>
           <w:rFonts w:ascii="Courier New" w:hAnsi="Courier New" w:cs="Courier New"/>
           <w:b/>
           <w:bCs/>
           <w:lang w:val="en-AU"/>
         </w:rPr>
-      </w:pPr>
-      <w:r>
+        <w:t>,</w:t>
+      </w:r>
+    </w:p>
+    <w:p>
+      <w:pPr>
+        <w:spacing w:after="0"/>
         <w:rPr>
           <w:rFonts w:ascii="Courier New" w:hAnsi="Courier New" w:cs="Courier New"/>
           <w:b/>
           <w:bCs/>
           <w:lang w:val="en-AU"/>
         </w:rPr>
-        <w:t>        return</w:t>
-      </w:r>
-    </w:p>
-    <w:p>
-      <w:pPr>
-        <w:spacing w:after="0"/>
+      </w:pPr>
+      <w:r>
         <w:rPr>
           <w:rFonts w:ascii="Courier New" w:hAnsi="Courier New" w:cs="Courier New"/>
           <w:b/>
           <w:bCs/>
           <w:lang w:val="en-AU"/>
         </w:rPr>
-      </w:pPr>
+        <w:t xml:space="preserve">        "practitioner": </w:t>
+      </w:r>
+      <w:proofErr w:type="spellStart"/>
       <w:r>
         <w:rPr>
           <w:rFonts w:ascii="Courier New" w:hAnsi="Courier New" w:cs="Courier New"/>
@@ -822,90 +963,91 @@
           <w:bCs/>
           <w:lang w:val="en-AU"/>
         </w:rPr>
-        <w:t>    for appointment in appointments:</w:t>
-      </w:r>
-    </w:p>
-    <w:p>
-      <w:pPr>
-        <w:spacing w:after="0"/>
+        <w:t>practitioner_name</w:t>
+      </w:r>
+      <w:proofErr w:type="spellEnd"/>
+      <w:r>
         <w:rPr>
           <w:rFonts w:ascii="Courier New" w:hAnsi="Courier New" w:cs="Courier New"/>
           <w:b/>
           <w:bCs/>
           <w:lang w:val="en-AU"/>
         </w:rPr>
-      </w:pPr>
-      <w:r>
+        <w:t>,</w:t>
+      </w:r>
+    </w:p>
+    <w:p>
+      <w:pPr>
+        <w:spacing w:after="0"/>
         <w:rPr>
           <w:rFonts w:ascii="Courier New" w:hAnsi="Courier New" w:cs="Courier New"/>
           <w:b/>
           <w:bCs/>
           <w:lang w:val="en-AU"/>
         </w:rPr>
-        <w:t>        print(f"Patient: {appointment['patient']} | Practitioner: {appointment['practitioner']} | Time: {appointment['time']}")</w:t>
-      </w:r>
-    </w:p>
-    <w:p>
-      <w:pPr>
-        <w:spacing w:after="0"/>
+      </w:pPr>
+      <w:r>
         <w:rPr>
           <w:rFonts w:ascii="Courier New" w:hAnsi="Courier New" w:cs="Courier New"/>
           <w:b/>
           <w:bCs/>
           <w:lang w:val="en-AU"/>
         </w:rPr>
-      </w:pPr>
-    </w:p>
-    <w:p>
-      <w:pPr>
-        <w:spacing w:after="0"/>
+        <w:t xml:space="preserve">        "time": </w:t>
+      </w:r>
+      <w:proofErr w:type="spellStart"/>
+      <w:r>
         <w:rPr>
           <w:rFonts w:ascii="Courier New" w:hAnsi="Courier New" w:cs="Courier New"/>
           <w:b/>
           <w:bCs/>
           <w:lang w:val="en-AU"/>
         </w:rPr>
-      </w:pPr>
-      <w:r>
+        <w:t>appointment_time</w:t>
+      </w:r>
+      <w:proofErr w:type="spellEnd"/>
+    </w:p>
+    <w:p>
+      <w:pPr>
+        <w:spacing w:after="0"/>
         <w:rPr>
           <w:rFonts w:ascii="Courier New" w:hAnsi="Courier New" w:cs="Courier New"/>
           <w:b/>
           <w:bCs/>
           <w:lang w:val="en-AU"/>
         </w:rPr>
-        <w:t>print("Welcome to SmartCare: The Clinical Appointment Booking System!")</w:t>
-      </w:r>
-    </w:p>
-    <w:p>
-      <w:pPr>
-        <w:spacing w:after="0"/>
+      </w:pPr>
+      <w:r>
         <w:rPr>
           <w:rFonts w:ascii="Courier New" w:hAnsi="Courier New" w:cs="Courier New"/>
           <w:b/>
           <w:bCs/>
           <w:lang w:val="en-AU"/>
         </w:rPr>
-      </w:pPr>
-      <w:r>
+        <w:t>    }</w:t>
+      </w:r>
+    </w:p>
+    <w:p>
+      <w:pPr>
+        <w:spacing w:after="0"/>
         <w:rPr>
           <w:rFonts w:ascii="Courier New" w:hAnsi="Courier New" w:cs="Courier New"/>
           <w:b/>
           <w:bCs/>
           <w:lang w:val="en-AU"/>
         </w:rPr>
-        <w:t>book_appointment('Alice Smith', 'Dr. John Doe', '2024-07-20 10:00 AM')</w:t>
-      </w:r>
-    </w:p>
-    <w:p>
-      <w:pPr>
-        <w:spacing w:after="0"/>
+      </w:pPr>
+      <w:r>
         <w:rPr>
           <w:rFonts w:ascii="Courier New" w:hAnsi="Courier New" w:cs="Courier New"/>
           <w:b/>
           <w:bCs/>
           <w:lang w:val="en-AU"/>
         </w:rPr>
-      </w:pPr>
+        <w:t xml:space="preserve">    </w:t>
+      </w:r>
+      <w:proofErr w:type="spellStart"/>
+      <w:proofErr w:type="gramStart"/>
       <w:r>
         <w:rPr>
           <w:rFonts w:ascii="Courier New" w:hAnsi="Courier New" w:cs="Courier New"/>
@@ -913,27 +1055,435 @@
           <w:bCs/>
           <w:lang w:val="en-AU"/>
         </w:rPr>
-        <w:t>book_appointment('Bob Johnson', 'Dr. Jane Roe', '2024-07-20 11:30 AM')</w:t>
-      </w:r>
-    </w:p>
-    <w:p>
-      <w:pPr>
-        <w:spacing w:after="0"/>
+        <w:t>appointments.append</w:t>
+      </w:r>
+      <w:proofErr w:type="spellEnd"/>
+      <w:proofErr w:type="gramEnd"/>
+      <w:r>
         <w:rPr>
           <w:rFonts w:ascii="Courier New" w:hAnsi="Courier New" w:cs="Courier New"/>
           <w:b/>
           <w:bCs/>
           <w:lang w:val="en-AU"/>
         </w:rPr>
-      </w:pPr>
-      <w:r>
+        <w:t>(appointment)</w:t>
+      </w:r>
+    </w:p>
+    <w:p>
+      <w:pPr>
+        <w:spacing w:after="0"/>
         <w:rPr>
           <w:rFonts w:ascii="Courier New" w:hAnsi="Courier New" w:cs="Courier New"/>
           <w:b/>
           <w:bCs/>
           <w:lang w:val="en-AU"/>
         </w:rPr>
-        <w:t>display_appointments()</w:t>
+      </w:pPr>
+    </w:p>
+    <w:p>
+      <w:pPr>
+        <w:spacing w:after="0"/>
+        <w:rPr>
+          <w:rFonts w:ascii="Courier New" w:hAnsi="Courier New" w:cs="Courier New"/>
+          <w:b/>
+          <w:bCs/>
+          <w:lang w:val="en-AU"/>
+        </w:rPr>
+      </w:pPr>
+      <w:r>
+        <w:rPr>
+          <w:rFonts w:ascii="Courier New" w:hAnsi="Courier New" w:cs="Courier New"/>
+          <w:b/>
+          <w:bCs/>
+          <w:lang w:val="en-AU"/>
+        </w:rPr>
+        <w:t xml:space="preserve">def </w:t>
+      </w:r>
+      <w:proofErr w:type="spellStart"/>
+      <w:r>
+        <w:rPr>
+          <w:rFonts w:ascii="Courier New" w:hAnsi="Courier New" w:cs="Courier New"/>
+          <w:b/>
+          <w:bCs/>
+          <w:lang w:val="en-AU"/>
+        </w:rPr>
+        <w:t>display_</w:t>
+      </w:r>
+      <w:proofErr w:type="gramStart"/>
+      <w:r>
+        <w:rPr>
+          <w:rFonts w:ascii="Courier New" w:hAnsi="Courier New" w:cs="Courier New"/>
+          <w:b/>
+          <w:bCs/>
+          <w:lang w:val="en-AU"/>
+        </w:rPr>
+        <w:t>appointments</w:t>
+      </w:r>
+      <w:proofErr w:type="spellEnd"/>
+      <w:r>
+        <w:rPr>
+          <w:rFonts w:ascii="Courier New" w:hAnsi="Courier New" w:cs="Courier New"/>
+          <w:b/>
+          <w:bCs/>
+          <w:lang w:val="en-AU"/>
+        </w:rPr>
+        <w:t>(</w:t>
+      </w:r>
+      <w:proofErr w:type="gramEnd"/>
+      <w:r>
+        <w:rPr>
+          <w:rFonts w:ascii="Courier New" w:hAnsi="Courier New" w:cs="Courier New"/>
+          <w:b/>
+          <w:bCs/>
+          <w:lang w:val="en-AU"/>
+        </w:rPr>
+        <w:t>):</w:t>
+      </w:r>
+    </w:p>
+    <w:p>
+      <w:pPr>
+        <w:spacing w:after="0"/>
+        <w:rPr>
+          <w:rFonts w:ascii="Courier New" w:hAnsi="Courier New" w:cs="Courier New"/>
+          <w:b/>
+          <w:bCs/>
+          <w:lang w:val="en-AU"/>
+        </w:rPr>
+      </w:pPr>
+      <w:r>
+        <w:rPr>
+          <w:rFonts w:ascii="Courier New" w:hAnsi="Courier New" w:cs="Courier New"/>
+          <w:b/>
+          <w:bCs/>
+          <w:lang w:val="en-AU"/>
+        </w:rPr>
+        <w:t>    if not appointments:</w:t>
+      </w:r>
+    </w:p>
+    <w:p>
+      <w:pPr>
+        <w:spacing w:after="0"/>
+        <w:rPr>
+          <w:rFonts w:ascii="Courier New" w:hAnsi="Courier New" w:cs="Courier New"/>
+          <w:b/>
+          <w:bCs/>
+          <w:lang w:val="en-AU"/>
+        </w:rPr>
+      </w:pPr>
+      <w:r>
+        <w:rPr>
+          <w:rFonts w:ascii="Courier New" w:hAnsi="Courier New" w:cs="Courier New"/>
+          <w:b/>
+          <w:bCs/>
+          <w:lang w:val="en-AU"/>
+        </w:rPr>
+        <w:t xml:space="preserve">        </w:t>
+      </w:r>
+      <w:proofErr w:type="gramStart"/>
+      <w:r>
+        <w:rPr>
+          <w:rFonts w:ascii="Courier New" w:hAnsi="Courier New" w:cs="Courier New"/>
+          <w:b/>
+          <w:bCs/>
+          <w:lang w:val="en-AU"/>
+        </w:rPr>
+        <w:t>print(</w:t>
+      </w:r>
+      <w:proofErr w:type="gramEnd"/>
+      <w:r>
+        <w:rPr>
+          <w:rFonts w:ascii="Courier New" w:hAnsi="Courier New" w:cs="Courier New"/>
+          <w:b/>
+          <w:bCs/>
+          <w:lang w:val="en-AU"/>
+        </w:rPr>
+        <w:t>"No appointments recorded.")</w:t>
+      </w:r>
+    </w:p>
+    <w:p>
+      <w:pPr>
+        <w:spacing w:after="0"/>
+        <w:rPr>
+          <w:rFonts w:ascii="Courier New" w:hAnsi="Courier New" w:cs="Courier New"/>
+          <w:b/>
+          <w:bCs/>
+          <w:lang w:val="en-AU"/>
+        </w:rPr>
+      </w:pPr>
+      <w:r>
+        <w:rPr>
+          <w:rFonts w:ascii="Courier New" w:hAnsi="Courier New" w:cs="Courier New"/>
+          <w:b/>
+          <w:bCs/>
+          <w:lang w:val="en-AU"/>
+        </w:rPr>
+        <w:t>        return</w:t>
+      </w:r>
+    </w:p>
+    <w:p>
+      <w:pPr>
+        <w:spacing w:after="0"/>
+        <w:rPr>
+          <w:rFonts w:ascii="Courier New" w:hAnsi="Courier New" w:cs="Courier New"/>
+          <w:b/>
+          <w:bCs/>
+          <w:lang w:val="en-AU"/>
+        </w:rPr>
+      </w:pPr>
+      <w:r>
+        <w:rPr>
+          <w:rFonts w:ascii="Courier New" w:hAnsi="Courier New" w:cs="Courier New"/>
+          <w:b/>
+          <w:bCs/>
+          <w:lang w:val="en-AU"/>
+        </w:rPr>
+        <w:t>    for appointment in appointments:</w:t>
+      </w:r>
+    </w:p>
+    <w:p>
+      <w:pPr>
+        <w:spacing w:after="0"/>
+        <w:rPr>
+          <w:rFonts w:ascii="Courier New" w:hAnsi="Courier New" w:cs="Courier New"/>
+          <w:b/>
+          <w:bCs/>
+          <w:lang w:val="en-AU"/>
+        </w:rPr>
+      </w:pPr>
+      <w:r>
+        <w:rPr>
+          <w:rFonts w:ascii="Courier New" w:hAnsi="Courier New" w:cs="Courier New"/>
+          <w:b/>
+          <w:bCs/>
+          <w:lang w:val="en-AU"/>
+        </w:rPr>
+        <w:t xml:space="preserve">        </w:t>
+      </w:r>
+      <w:proofErr w:type="gramStart"/>
+      <w:r>
+        <w:rPr>
+          <w:rFonts w:ascii="Courier New" w:hAnsi="Courier New" w:cs="Courier New"/>
+          <w:b/>
+          <w:bCs/>
+          <w:lang w:val="en-AU"/>
+        </w:rPr>
+        <w:t>print(</w:t>
+      </w:r>
+      <w:proofErr w:type="spellStart"/>
+      <w:proofErr w:type="gramEnd"/>
+      <w:r>
+        <w:rPr>
+          <w:rFonts w:ascii="Courier New" w:hAnsi="Courier New" w:cs="Courier New"/>
+          <w:b/>
+          <w:bCs/>
+          <w:lang w:val="en-AU"/>
+        </w:rPr>
+        <w:t>f"Patient</w:t>
+      </w:r>
+      <w:proofErr w:type="spellEnd"/>
+      <w:r>
+        <w:rPr>
+          <w:rFonts w:ascii="Courier New" w:hAnsi="Courier New" w:cs="Courier New"/>
+          <w:b/>
+          <w:bCs/>
+          <w:lang w:val="en-AU"/>
+        </w:rPr>
+        <w:t>: {appointment['patient']} | Practitioner: {appointment['practitioner']} | Time: {appointment['time']}")</w:t>
+      </w:r>
+    </w:p>
+    <w:p>
+      <w:pPr>
+        <w:spacing w:after="0"/>
+        <w:rPr>
+          <w:rFonts w:ascii="Courier New" w:hAnsi="Courier New" w:cs="Courier New"/>
+          <w:b/>
+          <w:bCs/>
+          <w:lang w:val="en-AU"/>
+        </w:rPr>
+      </w:pPr>
+    </w:p>
+    <w:p>
+      <w:pPr>
+        <w:spacing w:after="0"/>
+        <w:rPr>
+          <w:rFonts w:ascii="Courier New" w:hAnsi="Courier New" w:cs="Courier New"/>
+          <w:b/>
+          <w:bCs/>
+          <w:lang w:val="en-AU"/>
+        </w:rPr>
+      </w:pPr>
+      <w:proofErr w:type="gramStart"/>
+      <w:r>
+        <w:rPr>
+          <w:rFonts w:ascii="Courier New" w:hAnsi="Courier New" w:cs="Courier New"/>
+          <w:b/>
+          <w:bCs/>
+          <w:lang w:val="en-AU"/>
+        </w:rPr>
+        <w:t>print(</w:t>
+      </w:r>
+      <w:proofErr w:type="gramEnd"/>
+      <w:r>
+        <w:rPr>
+          <w:rFonts w:ascii="Courier New" w:hAnsi="Courier New" w:cs="Courier New"/>
+          <w:b/>
+          <w:bCs/>
+          <w:lang w:val="en-AU"/>
+        </w:rPr>
+        <w:t>"Welcome to SmartCare: The Clinical Appointment Booking System!")</w:t>
+      </w:r>
+    </w:p>
+    <w:p>
+      <w:pPr>
+        <w:spacing w:after="0"/>
+        <w:rPr>
+          <w:rFonts w:ascii="Courier New" w:hAnsi="Courier New" w:cs="Courier New"/>
+          <w:b/>
+          <w:bCs/>
+          <w:lang w:val="en-AU"/>
+        </w:rPr>
+      </w:pPr>
+      <w:proofErr w:type="spellStart"/>
+      <w:r>
+        <w:rPr>
+          <w:rFonts w:ascii="Courier New" w:hAnsi="Courier New" w:cs="Courier New"/>
+          <w:b/>
+          <w:bCs/>
+          <w:lang w:val="en-AU"/>
+        </w:rPr>
+        <w:t>book_</w:t>
+      </w:r>
+      <w:proofErr w:type="gramStart"/>
+      <w:r>
+        <w:rPr>
+          <w:rFonts w:ascii="Courier New" w:hAnsi="Courier New" w:cs="Courier New"/>
+          <w:b/>
+          <w:bCs/>
+          <w:lang w:val="en-AU"/>
+        </w:rPr>
+        <w:t>appointment</w:t>
+      </w:r>
+      <w:proofErr w:type="spellEnd"/>
+      <w:r>
+        <w:rPr>
+          <w:rFonts w:ascii="Courier New" w:hAnsi="Courier New" w:cs="Courier New"/>
+          <w:b/>
+          <w:bCs/>
+          <w:lang w:val="en-AU"/>
+        </w:rPr>
+        <w:t>(</w:t>
+      </w:r>
+      <w:proofErr w:type="gramEnd"/>
+      <w:r>
+        <w:rPr>
+          <w:rFonts w:ascii="Courier New" w:hAnsi="Courier New" w:cs="Courier New"/>
+          <w:b/>
+          <w:bCs/>
+          <w:lang w:val="en-AU"/>
+        </w:rPr>
+        <w:t>'Alice Smith', 'Dr. John Doe', '2024-07-20 10:00 AM')</w:t>
+      </w:r>
+    </w:p>
+    <w:p>
+      <w:pPr>
+        <w:spacing w:after="0"/>
+        <w:rPr>
+          <w:rFonts w:ascii="Courier New" w:hAnsi="Courier New" w:cs="Courier New"/>
+          <w:b/>
+          <w:bCs/>
+          <w:lang w:val="en-AU"/>
+        </w:rPr>
+      </w:pPr>
+      <w:proofErr w:type="spellStart"/>
+      <w:r>
+        <w:rPr>
+          <w:rFonts w:ascii="Courier New" w:hAnsi="Courier New" w:cs="Courier New"/>
+          <w:b/>
+          <w:bCs/>
+          <w:lang w:val="en-AU"/>
+        </w:rPr>
+        <w:t>book_</w:t>
+      </w:r>
+      <w:proofErr w:type="gramStart"/>
+      <w:r>
+        <w:rPr>
+          <w:rFonts w:ascii="Courier New" w:hAnsi="Courier New" w:cs="Courier New"/>
+          <w:b/>
+          <w:bCs/>
+          <w:lang w:val="en-AU"/>
+        </w:rPr>
+        <w:t>appointment</w:t>
+      </w:r>
+      <w:proofErr w:type="spellEnd"/>
+      <w:r>
+        <w:rPr>
+          <w:rFonts w:ascii="Courier New" w:hAnsi="Courier New" w:cs="Courier New"/>
+          <w:b/>
+          <w:bCs/>
+          <w:lang w:val="en-AU"/>
+        </w:rPr>
+        <w:t>(</w:t>
+      </w:r>
+      <w:proofErr w:type="gramEnd"/>
+      <w:r>
+        <w:rPr>
+          <w:rFonts w:ascii="Courier New" w:hAnsi="Courier New" w:cs="Courier New"/>
+          <w:b/>
+          <w:bCs/>
+          <w:lang w:val="en-AU"/>
+        </w:rPr>
+        <w:t>'Bob Johnson', 'Dr. Jane Roe', '2024-07-20 11:30 AM')</w:t>
+      </w:r>
+    </w:p>
+    <w:p>
+      <w:pPr>
+        <w:spacing w:after="0"/>
+        <w:rPr>
+          <w:rFonts w:ascii="Courier New" w:hAnsi="Courier New" w:cs="Courier New"/>
+          <w:b/>
+          <w:bCs/>
+          <w:lang w:val="en-AU"/>
+        </w:rPr>
+      </w:pPr>
+      <w:proofErr w:type="spellStart"/>
+      <w:r>
+        <w:rPr>
+          <w:rFonts w:ascii="Courier New" w:hAnsi="Courier New" w:cs="Courier New"/>
+          <w:b/>
+          <w:bCs/>
+          <w:lang w:val="en-AU"/>
+        </w:rPr>
+        <w:t>display_</w:t>
+      </w:r>
+      <w:proofErr w:type="gramStart"/>
+      <w:r>
+        <w:rPr>
+          <w:rFonts w:ascii="Courier New" w:hAnsi="Courier New" w:cs="Courier New"/>
+          <w:b/>
+          <w:bCs/>
+          <w:lang w:val="en-AU"/>
+        </w:rPr>
+        <w:t>appointments</w:t>
+      </w:r>
+      <w:proofErr w:type="spellEnd"/>
+      <w:r>
+        <w:rPr>
+          <w:rFonts w:ascii="Courier New" w:hAnsi="Courier New" w:cs="Courier New"/>
+          <w:b/>
+          <w:bCs/>
+          <w:lang w:val="en-AU"/>
+        </w:rPr>
+        <w:t>(</w:t>
+      </w:r>
+      <w:proofErr w:type="gramEnd"/>
+      <w:r>
+        <w:rPr>
+          <w:rFonts w:ascii="Courier New" w:hAnsi="Courier New" w:cs="Courier New"/>
+          <w:b/>
+          <w:bCs/>
+          <w:lang w:val="en-AU"/>
+        </w:rPr>
+        <w:t>)</w:t>
       </w:r>
     </w:p>
     <w:p/>
@@ -947,7 +1497,35 @@
         <w:rPr>
           <w:color w:val="C00000"/>
         </w:rPr>
-        <w:t>^ Now, run  both programs , and identify at least five limitations.</w:t>
+        <w:t xml:space="preserve">^ Now, </w:t>
+      </w:r>
+      <w:proofErr w:type="gramStart"/>
+      <w:r>
+        <w:rPr>
+          <w:color w:val="C00000"/>
+        </w:rPr>
+        <w:t>run  both</w:t>
+      </w:r>
+      <w:proofErr w:type="gramEnd"/>
+      <w:r>
+        <w:rPr>
+          <w:color w:val="C00000"/>
+        </w:rPr>
+        <w:t xml:space="preserve"> </w:t>
+      </w:r>
+      <w:proofErr w:type="gramStart"/>
+      <w:r>
+        <w:rPr>
+          <w:color w:val="C00000"/>
+        </w:rPr>
+        <w:t>programs ,</w:t>
+      </w:r>
+      <w:proofErr w:type="gramEnd"/>
+      <w:r>
+        <w:rPr>
+          <w:color w:val="C00000"/>
+        </w:rPr>
+        <w:t xml:space="preserve"> and identify at least five limitations.</w:t>
       </w:r>
     </w:p>
     <w:p>
@@ -1027,6 +1605,9 @@
       <w:r>
         <w:br/>
         <w:t>4. Do not rewrite the whole application.</w:t>
+      </w:r>
+      <w:r>
+        <w:tab/>
       </w:r>
       <w:r>
         <w:br/>
@@ -1127,8 +1708,13 @@
             <w:tcW w:w="3360" w:type="dxa"/>
           </w:tcPr>
           <w:p>
+            <w:proofErr w:type="gramStart"/>
             <w:r>
-              <w:t>Runs successfully?</w:t>
+              <w:t>Runs</w:t>
+            </w:r>
+            <w:proofErr w:type="gramEnd"/>
+            <w:r>
+              <w:t xml:space="preserve"> successfully?</w:t>
             </w:r>
           </w:p>
         </w:tc>
@@ -1247,8 +1833,13 @@
         <w:pStyle w:val="Heading1"/>
       </w:pPr>
       <w:r>
-        <w:t>Part F - Verify Behaviour</w:t>
-      </w:r>
+        <w:t xml:space="preserve">Part F - Verify </w:t>
+      </w:r>
+      <w:proofErr w:type="spellStart"/>
+      <w:r>
+        <w:t>Behaviour</w:t>
+      </w:r>
+      <w:proofErr w:type="spellEnd"/>
     </w:p>
     <w:p>
       <w:pPr>
@@ -1279,7 +1870,23 @@
         <w:pStyle w:val="ListBullet"/>
       </w:pPr>
       <w:r>
-        <w:t>Strange input such as patient_name=None or appointment_time=None</w:t>
+        <w:t xml:space="preserve">Strange input such as </w:t>
+      </w:r>
+      <w:proofErr w:type="spellStart"/>
+      <w:r>
+        <w:t>patient_name</w:t>
+      </w:r>
+      <w:proofErr w:type="spellEnd"/>
+      <w:r>
+        <w:t xml:space="preserve">=None or </w:t>
+      </w:r>
+      <w:proofErr w:type="spellStart"/>
+      <w:r>
+        <w:t>appointment_time</w:t>
+      </w:r>
+      <w:proofErr w:type="spellEnd"/>
+      <w:r>
+        <w:t>=None</w:t>
       </w:r>
     </w:p>
     <w:p>
@@ -1292,7 +1899,28 @@
     </w:p>
     <w:p>
       <w:r>
-        <w:t>Choose exactly one controlled improvement, for example: if not patient_name: raise ValueError("Patient name cannot be empty")</w:t>
+        <w:t xml:space="preserve">Choose exactly one controlled improvement, for example: if not </w:t>
+      </w:r>
+      <w:proofErr w:type="spellStart"/>
+      <w:r>
+        <w:t>patient_name</w:t>
+      </w:r>
+      <w:proofErr w:type="spellEnd"/>
+      <w:r>
+        <w:t xml:space="preserve">: raise </w:t>
+      </w:r>
+      <w:proofErr w:type="spellStart"/>
+      <w:proofErr w:type="gramStart"/>
+      <w:r>
+        <w:t>ValueError</w:t>
+      </w:r>
+      <w:proofErr w:type="spellEnd"/>
+      <w:r>
+        <w:t>(</w:t>
+      </w:r>
+      <w:proofErr w:type="gramEnd"/>
+      <w:r>
+        <w:t>"Patient name cannot be empty")</w:t>
       </w:r>
     </w:p>
     <w:p>
@@ -1399,7 +2027,7 @@
 </file>
 
 <file path=word/numbering.xml><?xml version="1.0" encoding="utf-8"?>
-<w:numbering xmlns:wpc="http://schemas.microsoft.com/office/word/2010/wordprocessingCanvas" xmlns:cx="http://schemas.microsoft.com/office/drawing/2014/chartex" xmlns:cx1="http://schemas.microsoft.com/office/drawing/2015/9/8/chartex" xmlns:cx2="http://schemas.microsoft.com/office/drawing/2015/10/21/chartex" xmlns:cx3="http://schemas.microsoft.com/office/drawing/2016/5/9/chartex" xmlns:cx4="http://schemas.microsoft.com/office/drawing/2016/5/10/chartex" xmlns:cx5="http://schemas.microsoft.com/office/drawing/2016/5/11/chartex" xmlns:cx6="http://schemas.microsoft.com/office/drawing/2016/5/12/chartex" xmlns:cx7="http://schemas.microsoft.com/office/drawing/2016/5/13/chartex" xmlns:cx8="http://schemas.microsoft.com/office/drawing/2016/5/14/chartex" xmlns:mc="http://schemas.openxmlformats.org/markup-compatibility/2006" xmlns:aink="http://schemas.microsoft.com/office/drawing/2016/ink" xmlns:am3d="http://schemas.microsoft.com/office/drawing/2017/model3d" xmlns:o="urn:schemas-microsoft-com:office:office" xmlns:oel="http://schemas.microsoft.com/office/2019/extlst" xmlns:r="http://schemas.openxmlformats.org/officeDocument/2006/relationships" xmlns:m="http://schemas.openxmlformats.org/officeDocument/2006/math" xmlns:v="urn:schemas-microsoft-com:vml" xmlns:wp14="http://schemas.microsoft.com/office/word/2010/wordprocessingDrawing" xmlns:wp="http://schemas.openxmlformats.org/drawingml/2006/wordprocessingDrawing" xmlns:w10="urn:schemas-microsoft-com:office:word" xmlns:w="http://schemas.openxmlformats.org/wordprocessingml/2006/main" xmlns:w14="http://schemas.microsoft.com/office/word/2010/wordml" xmlns:w15="http://schemas.microsoft.com/office/word/2012/wordml" xmlns:w16cei="http://schemas.microsoft.com/office/word/2026/wordml/cei" xmlns:w16cex="http://schemas.microsoft.com/office/word/2018/wordml/cex" xmlns:w16cid="http://schemas.microsoft.com/office/word/2016/wordml/cid" xmlns:w16="http://schemas.microsoft.com/office/word/2018/wordml" xmlns:w16du="http://schemas.microsoft.com/office/word/2023/wordml/word16du" xmlns:w16sdtdh="http://schemas.microsoft.com/office/word/2020/wordml/sdtdatahash" xmlns:w16sdtfl="http://schemas.microsoft.com/office/word/2024/wordml/sdtformatlock" xmlns:w16se="http://schemas.microsoft.com/office/word/2015/wordml/symex" xmlns:wpg="http://schemas.microsoft.com/office/word/2010/wordprocessingGroup" xmlns:wpi="http://schemas.microsoft.com/office/word/2010/wordprocessingInk" xmlns:wne="http://schemas.microsoft.com/office/word/2006/wordml" xmlns:wps="http://schemas.microsoft.com/office/word/2010/wordprocessingShape" mc:Ignorable="w14 w15 w16se w16cid w16 w16cex w16sdtdh w16sdtfl w16du wp14">
+<w:numbering xmlns:wpc="http://schemas.microsoft.com/office/word/2010/wordprocessingCanvas" xmlns:cx="http://schemas.microsoft.com/office/drawing/2014/chartex" xmlns:cx1="http://schemas.microsoft.com/office/drawing/2015/9/8/chartex" xmlns:cx2="http://schemas.microsoft.com/office/drawing/2015/10/21/chartex" xmlns:cx3="http://schemas.microsoft.com/office/drawing/2016/5/9/chartex" xmlns:cx4="http://schemas.microsoft.com/office/drawing/2016/5/10/chartex" xmlns:cx5="http://schemas.microsoft.com/office/drawing/2016/5/11/chartex" xmlns:cx6="http://schemas.microsoft.com/office/drawing/2016/5/12/chartex" xmlns:cx7="http://schemas.microsoft.com/office/drawing/2016/5/13/chartex" xmlns:cx8="http://schemas.microsoft.com/office/drawing/2016/5/14/chartex" xmlns:mc="http://schemas.openxmlformats.org/markup-compatibility/2006" xmlns:aink="http://schemas.microsoft.com/office/drawing/2016/ink" xmlns:am3d="http://schemas.microsoft.com/office/drawing/2017/model3d" xmlns:o="urn:schemas-microsoft-com:office:office" xmlns:oel="http://schemas.microsoft.com/office/2019/extlst" xmlns:r="http://schemas.openxmlformats.org/officeDocument/2006/relationships" xmlns:m="http://schemas.openxmlformats.org/officeDocument/2006/math" xmlns:v="urn:schemas-microsoft-com:vml" xmlns:wp14="http://schemas.microsoft.com/office/word/2010/wordprocessingDrawing" xmlns:wp="http://schemas.openxmlformats.org/drawingml/2006/wordprocessingDrawing" xmlns:w10="urn:schemas-microsoft-com:office:word" xmlns:w="http://schemas.openxmlformats.org/wordprocessingml/2006/main" xmlns:w14="http://schemas.microsoft.com/office/word/2010/wordml" xmlns:w15="http://schemas.microsoft.com/office/word/2012/wordml" xmlns:w16cex="http://schemas.microsoft.com/office/word/2018/wordml/cex" xmlns:w16cid="http://schemas.microsoft.com/office/word/2016/wordml/cid" xmlns:w16="http://schemas.microsoft.com/office/word/2018/wordml" xmlns:w16du="http://schemas.microsoft.com/office/word/2023/wordml/word16du" xmlns:w16sdtdh="http://schemas.microsoft.com/office/word/2020/wordml/sdtdatahash" xmlns:w16sdtfl="http://schemas.microsoft.com/office/word/2024/wordml/sdtformatlock" xmlns:w16se="http://schemas.microsoft.com/office/word/2015/wordml/symex" xmlns:wpg="http://schemas.microsoft.com/office/word/2010/wordprocessingGroup" xmlns:wpi="http://schemas.microsoft.com/office/word/2010/wordprocessingInk" xmlns:wne="http://schemas.microsoft.com/office/word/2006/wordml" xmlns:wps="http://schemas.microsoft.com/office/word/2010/wordprocessingShape" mc:Ignorable="w14 w15 w16se w16cid w16 w16cex w16sdtdh w16sdtfl w16du wp14">
   <w:abstractNum w:abstractNumId="0" w15:restartNumberingAfterBreak="0">
     <w:nsid w:val="FFFFFF7C"/>
     <w:multiLevelType w:val="singleLevel"/>

</xml_diff>